<commit_message>
Add composite photo to the family letter from the Letter Details card
Downloads (C02): rebased on the live Build file code; family letters now
place consults.composite_image right after the first paragraph below the
greeting, in PDF (JPEG pass-through, PNG decoded when zlib is available)
and Word. Doctor letters never carry it.

Review screen: family letter split moves to after the first paragraph.
New C · Save composite / C · Wait for composite queries, a wait function,
and n8n C03 to fetch the uploaded file into composite_image without
regenerating letters. Tested against Postgres 16 and the Code node harness.

Co-Authored-By: Claude Opus 5.5 <noreply@anthropic.com>
Claude-Session: https://claude.ai/code/session_01LrQdmTGq1i4WWuoacSjuug
</commit_message>
<xml_diff>
--- a/consult/downloads/samples/Leo Marsh - Doctor Letter.docx
+++ b/consult/downloads/samples/Leo Marsh - Doctor Letter.docx
@@ -5,14 +5,14 @@
     <w:p>
       <w:pPr>
         <w:keepLines/>
-        <w:spacing w:before="0" w:after="560" w:line="384" w:lineRule="auto"/>
-      </w:pPr>
-      <w:r>
-        <w:rPr>
-          <w:rFonts w:ascii="Arial" w:hAnsi="Arial" w:cs="Arial"/>
-          <w:color w:val="3D3836"/>
-          <w:sz w:val="21"/>
-          <w:szCs w:val="21"/>
+        <w:spacing w:before="0" w:after="460" w:line="271" w:lineRule="auto"/>
+      </w:pPr>
+      <w:r>
+        <w:rPr>
+          <w:rFonts w:ascii="Times New Roman" w:hAnsi="Times New Roman" w:cs="Times New Roman"/>
+          <w:color w:val="1F1D1B"/>
+          <w:sz w:val="23"/>
+          <w:szCs w:val="23"/>
         </w:rPr>
         <w:t xml:space="preserve">October 6, 2026</w:t>
       </w:r>
@@ -20,14 +20,14 @@
     <w:p>
       <w:pPr>
         <w:keepLines/>
-        <w:spacing w:before="0" w:after="200" w:line="384" w:lineRule="auto"/>
-      </w:pPr>
-      <w:r>
-        <w:rPr>
-          <w:rFonts w:ascii="Arial" w:hAnsi="Arial" w:cs="Arial"/>
-          <w:color w:val="3D3836"/>
-          <w:sz w:val="21"/>
-          <w:szCs w:val="21"/>
+        <w:spacing w:before="0" w:after="180" w:line="271" w:lineRule="auto"/>
+      </w:pPr>
+      <w:r>
+        <w:rPr>
+          <w:rFonts w:ascii="Times New Roman" w:hAnsi="Times New Roman" w:cs="Times New Roman"/>
+          <w:color w:val="1F1D1B"/>
+          <w:sz w:val="23"/>
+          <w:szCs w:val="23"/>
         </w:rPr>
         <w:t xml:space="preserve">Hi Samuel,</w:t>
       </w:r>
@@ -35,14 +35,14 @@
     <w:p>
       <w:pPr>
         <w:keepLines/>
-        <w:spacing w:before="0" w:after="200" w:line="384" w:lineRule="auto"/>
-      </w:pPr>
-      <w:r>
-        <w:rPr>
-          <w:rFonts w:ascii="Arial" w:hAnsi="Arial" w:cs="Arial"/>
-          <w:color w:val="3D3836"/>
-          <w:sz w:val="21"/>
-          <w:szCs w:val="21"/>
+        <w:spacing w:before="0" w:after="180" w:line="271" w:lineRule="auto"/>
+      </w:pPr>
+      <w:r>
+        <w:rPr>
+          <w:rFonts w:ascii="Times New Roman" w:hAnsi="Times New Roman" w:cs="Times New Roman"/>
+          <w:color w:val="1F1D1B"/>
+          <w:sz w:val="23"/>
+          <w:szCs w:val="23"/>
         </w:rPr>
         <w:t xml:space="preserve">Thank you for referring Leo to our office. I wanted to share our clinical findings and the treatment plan we have outlined for him.</w:t>
       </w:r>
@@ -50,14 +50,14 @@
     <w:p>
       <w:pPr>
         <w:keepLines/>
-        <w:spacing w:before="0" w:after="200" w:line="384" w:lineRule="auto"/>
-      </w:pPr>
-      <w:r>
-        <w:rPr>
-          <w:rFonts w:ascii="Arial" w:hAnsi="Arial" w:cs="Arial"/>
-          <w:color w:val="3D3836"/>
-          <w:sz w:val="21"/>
-          <w:szCs w:val="21"/>
+        <w:spacing w:before="0" w:after="180" w:line="271" w:lineRule="auto"/>
+      </w:pPr>
+      <w:r>
+        <w:rPr>
+          <w:rFonts w:ascii="Times New Roman" w:hAnsi="Times New Roman" w:cs="Times New Roman"/>
+          <w:color w:val="1F1D1B"/>
+          <w:sz w:val="23"/>
+          <w:szCs w:val="23"/>
         </w:rPr>
         <w:t xml:space="preserve">Leo presents with a Class I molar relationship bilaterally. His overbite measures 40% and his overjet is 5 mm. In the mandibular arch, there is 3 mm of crowding. We also noted an over-retained mandibular right primary second molar, which will need to be addressed at the outset of treatment.</w:t>
       </w:r>
@@ -65,14 +65,14 @@
     <w:p>
       <w:pPr>
         <w:keepLines/>
-        <w:spacing w:before="0" w:after="200" w:line="384" w:lineRule="auto"/>
-      </w:pPr>
-      <w:r>
-        <w:rPr>
-          <w:rFonts w:ascii="Arial" w:hAnsi="Arial" w:cs="Arial"/>
-          <w:color w:val="3D3836"/>
-          <w:sz w:val="21"/>
-          <w:szCs w:val="21"/>
+        <w:spacing w:before="0" w:after="180" w:line="271" w:lineRule="auto"/>
+      </w:pPr>
+      <w:r>
+        <w:rPr>
+          <w:rFonts w:ascii="Times New Roman" w:hAnsi="Times New Roman" w:cs="Times New Roman"/>
+          <w:color w:val="1F1D1B"/>
+          <w:sz w:val="23"/>
+          <w:szCs w:val="23"/>
         </w:rPr>
         <w:t xml:space="preserve">Our treatment sequence will begin with removal of the lower right primary second molar. Following that, we will bond both the maxillary and mandibular arches and proceed with alignment and leveling. We anticipate the overall treatment time to be in the range of 18 to 24 months.</w:t>
       </w:r>
@@ -80,14 +80,14 @@
     <w:p>
       <w:pPr>
         <w:keepLines/>
-        <w:spacing w:before="0" w:after="200" w:line="384" w:lineRule="auto"/>
-      </w:pPr>
-      <w:r>
-        <w:rPr>
-          <w:rFonts w:ascii="Arial" w:hAnsi="Arial" w:cs="Arial"/>
-          <w:color w:val="3D3836"/>
-          <w:sz w:val="21"/>
-          <w:szCs w:val="21"/>
+        <w:spacing w:before="0" w:after="180" w:line="271" w:lineRule="auto"/>
+      </w:pPr>
+      <w:r>
+        <w:rPr>
+          <w:rFonts w:ascii="Times New Roman" w:hAnsi="Times New Roman" w:cs="Times New Roman"/>
+          <w:color w:val="1F1D1B"/>
+          <w:sz w:val="23"/>
+          <w:szCs w:val="23"/>
         </w:rPr>
         <w:t xml:space="preserve">Please do not hesitate to reach out if you have any questions about Leo's care. We appreciate the referral and look forward to working with him.</w:t>
       </w:r>
@@ -95,50 +95,50 @@
     <w:p>
       <w:pPr>
         <w:keepLines/>
-        <w:spacing w:before="0" w:after="200" w:line="384" w:lineRule="auto"/>
-      </w:pPr>
-      <w:r>
-        <w:rPr>
-          <w:rFonts w:ascii="Arial" w:hAnsi="Arial" w:cs="Arial"/>
-          <w:color w:val="3D3836"/>
-          <w:sz w:val="21"/>
-          <w:szCs w:val="21"/>
+        <w:spacing w:before="0" w:after="0" w:line="271" w:lineRule="auto"/>
+      </w:pPr>
+      <w:r>
+        <w:rPr>
+          <w:rFonts w:ascii="Times New Roman" w:hAnsi="Times New Roman" w:cs="Times New Roman"/>
+          <w:color w:val="1F1D1B"/>
+          <w:sz w:val="23"/>
+          <w:szCs w:val="23"/>
         </w:rPr>
         <w:t xml:space="preserve">Thanks,</w:t>
       </w:r>
       <w:r>
         <w:rPr>
-          <w:rFonts w:ascii="Arial" w:hAnsi="Arial" w:cs="Arial"/>
-          <w:color w:val="3D3836"/>
-          <w:sz w:val="21"/>
-          <w:szCs w:val="21"/>
+          <w:rFonts w:ascii="Times New Roman" w:hAnsi="Times New Roman" w:cs="Times New Roman"/>
+          <w:color w:val="1F1D1B"/>
+          <w:sz w:val="23"/>
+          <w:szCs w:val="23"/>
         </w:rPr>
         <w:br/>
       </w:r>
       <w:r>
         <w:rPr>
-          <w:rFonts w:ascii="Arial" w:hAnsi="Arial" w:cs="Arial"/>
-          <w:color w:val="3D3836"/>
-          <w:sz w:val="21"/>
-          <w:szCs w:val="21"/>
+          <w:rFonts w:ascii="Times New Roman" w:hAnsi="Times New Roman" w:cs="Times New Roman"/>
+          <w:color w:val="1F1D1B"/>
+          <w:sz w:val="23"/>
+          <w:szCs w:val="23"/>
         </w:rPr>
         <w:t xml:space="preserve">Best,</w:t>
       </w:r>
       <w:r>
         <w:rPr>
-          <w:rFonts w:ascii="Arial" w:hAnsi="Arial" w:cs="Arial"/>
-          <w:color w:val="3D3836"/>
-          <w:sz w:val="21"/>
-          <w:szCs w:val="21"/>
+          <w:rFonts w:ascii="Times New Roman" w:hAnsi="Times New Roman" w:cs="Times New Roman"/>
+          <w:color w:val="1F1D1B"/>
+          <w:sz w:val="23"/>
+          <w:szCs w:val="23"/>
         </w:rPr>
         <w:br/>
       </w:r>
       <w:r>
         <w:rPr>
-          <w:rFonts w:ascii="Arial" w:hAnsi="Arial" w:cs="Arial"/>
-          <w:color w:val="3D3836"/>
-          <w:sz w:val="21"/>
-          <w:szCs w:val="21"/>
+          <w:rFonts w:ascii="Times New Roman" w:hAnsi="Times New Roman" w:cs="Times New Roman"/>
+          <w:color w:val="1F1D1B"/>
+          <w:sz w:val="23"/>
+          <w:szCs w:val="23"/>
         </w:rPr>
         <w:t xml:space="preserve">Marc S. Lemchen, DMD</w:t>
       </w:r>
@@ -293,7 +293,7 @@
   </w:p>
   <w:p>
     <w:pPr>
-      <w:spacing w:before="0" w:after="0" w:line="792" w:lineRule="exact"/>
+      <w:spacing w:before="0" w:after="0" w:line="648" w:lineRule="exact"/>
     </w:pPr>
   </w:p>
 </w:hdr>

</xml_diff>